<commit_message>
Update Lab 1 report wording
</commit_message>
<xml_diff>
--- a/Lab-1/Lab1_Report.docx
+++ b/Lab-1/Lab1_Report.docx
@@ -35,7 +35,7 @@
     </w:p>
     <w:p>
       <w:r>
-        <w:t>The experiment compares an explicit scholarship-screening rule with a probability threshold, then extends the transparent rule with GPA and recommendation conditions. Review means “send to a human reviewer”; it is not an automated award decision. All scores, probabilities and thresholds are synthetic lab inputs, not evidence of model accuracy.</w:t>
+        <w:t>In this lab I compared a simple rule with a probability threshold. I also added GPA and recommendation checks to the rule. Review means “send to a human reviewer”; it is not an automated award decision. All scores, probabilities and thresholds are synthetic lab inputs, not evidence of model accuracy.</w:t>
       </w:r>
     </w:p>
     <w:p>
@@ -325,7 +325,7 @@
     </w:p>
     <w:p>
       <w:r>
-        <w:t>The explicit rule returns Review only when the application is complete and score ≥ 70. The threshold rule returns Review when probability ≥ 0.70. The probability value is supplied as an input; this script does not train a classifier or establish accuracy.</w:t>
+        <w:t>The rule gives Review only when the documents are complete and the score is at least 70. The threshold rule returns Review when probability ≥ 0.70. The probability is only an input for this exercise. This code does not train a model and does not prove accuracy.</w:t>
       </w:r>
     </w:p>
     <w:p>
@@ -562,7 +562,7 @@
     </w:p>
     <w:p>
       <w:r>
-        <w:t>A conversational test observes whether an evaluator is persuaded by linguistic interaction under the chosen questions. It does not establish reliable perception, grounded world knowledge, transparent decision logic, robustness to distribution shift, or safe action. In this scholarship case, an assistant could fluently say “the 0.88 probability means Review” while overlooking that documents_complete is False; fluent wording would not prove that the screening policy was followed. A stronger additional test is a held-out, auditable suite of complete/incomplete applications with known labels, adversarial missing fields, calibration checks and human review of disagreements.</w:t>
+        <w:t>A conversational test mainly checks how convincing the answers sound in a conversation. It does not establish reliable perception, grounded world knowledge, transparent decision logic, robustness to distribution shift, or safe action. In this scholarship case, an assistant could fluently say “the 0.88 probability means Review” while overlooking that documents_complete is False; fluent wording would not prove that the screening policy was followed. A stronger additional test is a held-out, auditable suite of complete/incomplete applications with known labels, adversarial missing fields, calibration checks and human review of disagreements.</w:t>
       </w:r>
     </w:p>
     <w:p>
@@ -664,6 +664,13 @@
       </w:pPr>
       <w:r>
         <w:t>Krizhevsky, Sutskever &amp; Hinton, “ImageNet Classification with Deep Convolutional Neural Networks” (2012): https://papers.nips.cc/paper/4824-imagenet-classification-with-deep-convolutional-neural-networks</w:t>
+      </w:r>
+    </w:p>
+    <w:p>
+      <w:r>
+        <w:br/>
+        <w:br/>
+        <w:t>Personal run note: I ran both Lab 1 programs with Python 3. The output showed two disagreements: complete_low and incomplete_high. These disagreements happen because the threshold does not check the same conditions as the transparent rule.</w:t>
       </w:r>
     </w:p>
     <w:sectPr>

</xml_diff>